<commit_message>
Adjusted GPTQ code for PHI on cloud and Added new edge evaluations
</commit_message>
<xml_diff>
--- a/Evaluations/InferenceEvaluations/EdgeEvaluation/Inference_Comparison.docx
+++ b/Evaluations/InferenceEvaluations/EdgeEvaluation/Inference_Comparison.docx
@@ -5889,11 +5889,10 @@
             </w:pPr>
             <w:r>
               <w:rPr>
-                <w:rFonts w:eastAsia="Arial"/>
-                <w:sz w:val="14"/>
-                <w:szCs w:val="14"/>
-              </w:rPr>
-              <w:t>N/A</w:t>
+                <w:sz w:val="14"/>
+                <w:szCs w:val="14"/>
+              </w:rPr>
+              <w:t>0.03 ± 0.00</w:t>
             </w:r>
           </w:p>
         </w:tc>
@@ -5923,7 +5922,7 @@
                 <w:sz w:val="14"/>
                 <w:szCs w:val="14"/>
               </w:rPr>
-              <w:t>N/A</w:t>
+              <w:t>74.03 ± 0.59</w:t>
             </w:r>
           </w:p>
         </w:tc>
@@ -5953,7 +5952,7 @@
                 <w:sz w:val="14"/>
                 <w:szCs w:val="14"/>
               </w:rPr>
-              <w:t>N/A</w:t>
+              <w:t>2.04 ± 0.02</w:t>
             </w:r>
           </w:p>
         </w:tc>
@@ -5985,7 +5984,7 @@
                 <w:sz w:val="14"/>
                 <w:szCs w:val="14"/>
               </w:rPr>
-              <w:t>N/A</w:t>
+              <w:t>2.04 ± 0.02</w:t>
             </w:r>
           </w:p>
         </w:tc>
@@ -6015,7 +6014,7 @@
                 <w:sz w:val="14"/>
                 <w:szCs w:val="14"/>
               </w:rPr>
-              <w:t>N/A</w:t>
+              <w:t>73.37 ± 0.59</w:t>
             </w:r>
           </w:p>
         </w:tc>
@@ -6493,11 +6492,10 @@
             </w:pPr>
             <w:r>
               <w:rPr>
-                <w:rFonts w:eastAsia="Arial"/>
-                <w:sz w:val="14"/>
-                <w:szCs w:val="14"/>
-              </w:rPr>
-              <w:t>N/A</w:t>
+                <w:sz w:val="14"/>
+                <w:szCs w:val="14"/>
+              </w:rPr>
+              <w:t>0.03 ± 0.00</w:t>
             </w:r>
           </w:p>
         </w:tc>
@@ -6527,7 +6525,7 @@
                 <w:sz w:val="14"/>
                 <w:szCs w:val="14"/>
               </w:rPr>
-              <w:t>N/A</w:t>
+              <w:t>74.15 ± 0.06</w:t>
             </w:r>
           </w:p>
         </w:tc>
@@ -6557,7 +6555,7 @@
                 <w:sz w:val="14"/>
                 <w:szCs w:val="14"/>
               </w:rPr>
-              <w:t>N/A</w:t>
+              <w:t>2.04 ± 0.00</w:t>
             </w:r>
           </w:p>
         </w:tc>
@@ -6588,7 +6586,7 @@
                 <w:sz w:val="14"/>
                 <w:szCs w:val="14"/>
               </w:rPr>
-              <w:t>N/A</w:t>
+              <w:t>2.04 ± 0.00</w:t>
             </w:r>
           </w:p>
         </w:tc>
@@ -6618,7 +6616,7 @@
                 <w:sz w:val="14"/>
                 <w:szCs w:val="14"/>
               </w:rPr>
-              <w:t>N/A</w:t>
+              <w:t>73.49 ± 0.07</w:t>
             </w:r>
           </w:p>
         </w:tc>
@@ -7318,11 +7316,10 @@
             </w:pPr>
             <w:r>
               <w:rPr>
-                <w:rFonts w:eastAsia="Arial"/>
-                <w:sz w:val="14"/>
-                <w:szCs w:val="14"/>
-              </w:rPr>
-              <w:t>N/A</w:t>
+                <w:sz w:val="14"/>
+                <w:szCs w:val="14"/>
+              </w:rPr>
+              <w:t>0.03 ± 0.00</w:t>
             </w:r>
           </w:p>
         </w:tc>
@@ -7352,7 +7349,7 @@
                 <w:sz w:val="14"/>
                 <w:szCs w:val="14"/>
               </w:rPr>
-              <w:t>N/A</w:t>
+              <w:t>72.70 ± 0.42</w:t>
             </w:r>
           </w:p>
         </w:tc>
@@ -7382,7 +7379,7 @@
                 <w:sz w:val="14"/>
                 <w:szCs w:val="14"/>
               </w:rPr>
-              <w:t>N/A</w:t>
+              <w:t>2.08 ± 0.01</w:t>
             </w:r>
           </w:p>
         </w:tc>
@@ -7413,7 +7410,7 @@
                 <w:sz w:val="14"/>
                 <w:szCs w:val="14"/>
               </w:rPr>
-              <w:t>N/A</w:t>
+              <w:t>2.08 ± 0.01</w:t>
             </w:r>
           </w:p>
         </w:tc>
@@ -7443,7 +7440,7 @@
                 <w:sz w:val="14"/>
                 <w:szCs w:val="14"/>
               </w:rPr>
-              <w:t>N/A</w:t>
+              <w:t>72.05 ± 0.41</w:t>
             </w:r>
           </w:p>
         </w:tc>
@@ -7922,11 +7919,10 @@
             </w:pPr>
             <w:r>
               <w:rPr>
-                <w:rFonts w:eastAsia="Arial"/>
-                <w:sz w:val="14"/>
-                <w:szCs w:val="14"/>
-              </w:rPr>
-              <w:t>N/A</w:t>
+                <w:sz w:val="14"/>
+                <w:szCs w:val="14"/>
+              </w:rPr>
+              <w:t>0.03 ± 0.00</w:t>
             </w:r>
           </w:p>
         </w:tc>
@@ -7956,7 +7952,7 @@
                 <w:sz w:val="14"/>
                 <w:szCs w:val="14"/>
               </w:rPr>
-              <w:t>N/A</w:t>
+              <w:t>72.56 ± 0.07</w:t>
             </w:r>
           </w:p>
         </w:tc>
@@ -7986,7 +7982,7 @@
                 <w:sz w:val="14"/>
                 <w:szCs w:val="14"/>
               </w:rPr>
-              <w:t>N/A</w:t>
+              <w:t>2.09 ± 0.00</w:t>
             </w:r>
           </w:p>
         </w:tc>
@@ -8017,7 +8013,7 @@
                 <w:sz w:val="14"/>
                 <w:szCs w:val="14"/>
               </w:rPr>
-              <w:t>N/A</w:t>
+              <w:t>2.09 ± 0.00</w:t>
             </w:r>
           </w:p>
         </w:tc>
@@ -8047,7 +8043,7 @@
                 <w:sz w:val="14"/>
                 <w:szCs w:val="14"/>
               </w:rPr>
-              <w:t>N/A</w:t>
+              <w:t>71.92 ± 0.08</w:t>
             </w:r>
           </w:p>
         </w:tc>
@@ -8526,11 +8522,10 @@
             </w:pPr>
             <w:r>
               <w:rPr>
-                <w:rFonts w:eastAsia="Arial"/>
-                <w:sz w:val="14"/>
-                <w:szCs w:val="14"/>
-              </w:rPr>
-              <w:t>N/A</w:t>
+                <w:sz w:val="14"/>
+                <w:szCs w:val="14"/>
+              </w:rPr>
+              <w:t>0.03 ± 0.00</w:t>
             </w:r>
           </w:p>
         </w:tc>
@@ -8560,7 +8555,7 @@
                 <w:sz w:val="14"/>
                 <w:szCs w:val="14"/>
               </w:rPr>
-              <w:t>N/A</w:t>
+              <w:t>72.65 ± 0.12</w:t>
             </w:r>
           </w:p>
         </w:tc>
@@ -8590,7 +8585,7 @@
                 <w:sz w:val="14"/>
                 <w:szCs w:val="14"/>
               </w:rPr>
-              <w:t>N/A</w:t>
+              <w:t>2.08 ± 0.00</w:t>
             </w:r>
           </w:p>
         </w:tc>
@@ -8621,7 +8616,7 @@
                 <w:sz w:val="14"/>
                 <w:szCs w:val="14"/>
               </w:rPr>
-              <w:t>N/A</w:t>
+              <w:t>2.08 ± 0.00</w:t>
             </w:r>
           </w:p>
         </w:tc>
@@ -8651,7 +8646,7 @@
                 <w:sz w:val="14"/>
                 <w:szCs w:val="14"/>
               </w:rPr>
-              <w:t>N/A</w:t>
+              <w:t>72.02 ± 0.12</w:t>
             </w:r>
           </w:p>
         </w:tc>
@@ -9138,11 +9133,10 @@
             </w:pPr>
             <w:r>
               <w:rPr>
-                <w:rFonts w:eastAsia="Arial"/>
-                <w:sz w:val="14"/>
-                <w:szCs w:val="14"/>
-              </w:rPr>
-              <w:t>N/A</w:t>
+                <w:sz w:val="14"/>
+                <w:szCs w:val="14"/>
+              </w:rPr>
+              <w:t>0.03 ± 0.00</w:t>
             </w:r>
           </w:p>
         </w:tc>
@@ -9172,7 +9166,7 @@
                 <w:sz w:val="14"/>
                 <w:szCs w:val="14"/>
               </w:rPr>
-              <w:t>N/A</w:t>
+              <w:t>77.05 ± 0.10</w:t>
             </w:r>
           </w:p>
         </w:tc>
@@ -9202,7 +9196,7 @@
                 <w:sz w:val="14"/>
                 <w:szCs w:val="14"/>
               </w:rPr>
-              <w:t>N/A</w:t>
+              <w:t>1.96 ± 0.00</w:t>
             </w:r>
           </w:p>
         </w:tc>
@@ -9233,7 +9227,7 @@
                 <w:sz w:val="14"/>
                 <w:szCs w:val="14"/>
               </w:rPr>
-              <w:t>N/A</w:t>
+              <w:t>1.96 ± 0.00</w:t>
             </w:r>
           </w:p>
         </w:tc>
@@ -9263,7 +9257,7 @@
                 <w:sz w:val="14"/>
                 <w:szCs w:val="14"/>
               </w:rPr>
-              <w:t>N/A</w:t>
+              <w:t>76.37 ± 0.10</w:t>
             </w:r>
           </w:p>
         </w:tc>
@@ -9746,7 +9740,7 @@
                 <w:sz w:val="14"/>
                 <w:szCs w:val="14"/>
               </w:rPr>
-              <w:t>N/A</w:t>
+              <w:t>0.03 ± 0.00</w:t>
             </w:r>
           </w:p>
         </w:tc>
@@ -9776,7 +9770,7 @@
                 <w:sz w:val="14"/>
                 <w:szCs w:val="14"/>
               </w:rPr>
-              <w:t>N/A</w:t>
+              <w:t>77.04 ± 0.15</w:t>
             </w:r>
           </w:p>
         </w:tc>
@@ -9806,7 +9800,7 @@
                 <w:sz w:val="14"/>
                 <w:szCs w:val="14"/>
               </w:rPr>
-              <w:t>N/A</w:t>
+              <w:t>1.96 ± 0.00</w:t>
             </w:r>
           </w:p>
         </w:tc>
@@ -9837,7 +9831,7 @@
                 <w:sz w:val="14"/>
                 <w:szCs w:val="14"/>
               </w:rPr>
-              <w:t>N/A</w:t>
+              <w:t>1.96 ± 0.00</w:t>
             </w:r>
           </w:p>
         </w:tc>
@@ -9867,7 +9861,7 @@
                 <w:sz w:val="14"/>
                 <w:szCs w:val="14"/>
               </w:rPr>
-              <w:t>N/A</w:t>
+              <w:t>76.37 ± 0.15</w:t>
             </w:r>
           </w:p>
         </w:tc>
@@ -10346,11 +10340,10 @@
             </w:pPr>
             <w:r>
               <w:rPr>
-                <w:rFonts w:eastAsia="Arial"/>
-                <w:sz w:val="14"/>
-                <w:szCs w:val="14"/>
-              </w:rPr>
-              <w:t>N/A</w:t>
+                <w:sz w:val="14"/>
+                <w:szCs w:val="14"/>
+              </w:rPr>
+              <w:t>0.03 ± 0.00</w:t>
             </w:r>
           </w:p>
         </w:tc>
@@ -10380,7 +10373,7 @@
                 <w:sz w:val="14"/>
                 <w:szCs w:val="14"/>
               </w:rPr>
-              <w:t>N/A</w:t>
+              <w:t>77.51 ± 1.42</w:t>
             </w:r>
           </w:p>
         </w:tc>
@@ -10410,7 +10403,7 @@
                 <w:sz w:val="14"/>
                 <w:szCs w:val="14"/>
               </w:rPr>
-              <w:t>N/A</w:t>
+              <w:t>1.95 ± 0.03</w:t>
             </w:r>
           </w:p>
         </w:tc>
@@ -10441,7 +10434,7 @@
                 <w:sz w:val="14"/>
                 <w:szCs w:val="14"/>
               </w:rPr>
-              <w:t>N/A</w:t>
+              <w:t>1.95 ± 0.03</w:t>
             </w:r>
           </w:p>
         </w:tc>
@@ -10471,7 +10464,7 @@
                 <w:sz w:val="14"/>
                 <w:szCs w:val="14"/>
               </w:rPr>
-              <w:t>N/A</w:t>
+              <w:t>76.85 ± 1.40</w:t>
             </w:r>
           </w:p>
         </w:tc>
@@ -10968,11 +10961,10 @@
             </w:pPr>
             <w:r>
               <w:rPr>
-                <w:rFonts w:eastAsia="Arial"/>
-                <w:sz w:val="14"/>
-                <w:szCs w:val="14"/>
-              </w:rPr>
-              <w:t>N/A</w:t>
+                <w:sz w:val="14"/>
+                <w:szCs w:val="14"/>
+              </w:rPr>
+              <w:t>0.03 ± 0.00</w:t>
             </w:r>
           </w:p>
         </w:tc>
@@ -11002,7 +10994,7 @@
                 <w:sz w:val="14"/>
                 <w:szCs w:val="14"/>
               </w:rPr>
-              <w:t>N/A</w:t>
+              <w:t>74.21 ± 0.46</w:t>
             </w:r>
           </w:p>
         </w:tc>
@@ -11032,7 +11024,7 @@
                 <w:sz w:val="14"/>
                 <w:szCs w:val="14"/>
               </w:rPr>
-              <w:t>N/A</w:t>
+              <w:t>2.04 ± 0.01</w:t>
             </w:r>
           </w:p>
         </w:tc>
@@ -11063,7 +11055,7 @@
                 <w:sz w:val="14"/>
                 <w:szCs w:val="14"/>
               </w:rPr>
-              <w:t>N/A</w:t>
+              <w:t>2.04 ± 0.01</w:t>
             </w:r>
           </w:p>
         </w:tc>
@@ -11093,7 +11085,7 @@
                 <w:sz w:val="14"/>
                 <w:szCs w:val="14"/>
               </w:rPr>
-              <w:t>N/A</w:t>
+              <w:t>73.55 ± 0.45</w:t>
             </w:r>
           </w:p>
         </w:tc>
@@ -11572,11 +11564,10 @@
             </w:pPr>
             <w:r>
               <w:rPr>
-                <w:rFonts w:eastAsia="Arial"/>
-                <w:sz w:val="14"/>
-                <w:szCs w:val="14"/>
-              </w:rPr>
-              <w:t>N/A</w:t>
+                <w:sz w:val="14"/>
+                <w:szCs w:val="14"/>
+              </w:rPr>
+              <w:t>0.03 ± 0.00</w:t>
             </w:r>
           </w:p>
         </w:tc>
@@ -11606,7 +11597,7 @@
                 <w:sz w:val="14"/>
                 <w:szCs w:val="14"/>
               </w:rPr>
-              <w:t>N/A</w:t>
+              <w:t>74.15 ± 0.64</w:t>
             </w:r>
           </w:p>
         </w:tc>
@@ -11638,7 +11629,7 @@
                 <w:sz w:val="14"/>
                 <w:szCs w:val="14"/>
               </w:rPr>
-              <w:t>N/A</w:t>
+              <w:t>2.04 ± 0.02</w:t>
             </w:r>
           </w:p>
         </w:tc>
@@ -11669,7 +11660,7 @@
                 <w:sz w:val="14"/>
                 <w:szCs w:val="14"/>
               </w:rPr>
-              <w:t>N/A</w:t>
+              <w:t>2.04 ± 0.02</w:t>
             </w:r>
           </w:p>
         </w:tc>
@@ -11699,7 +11690,7 @@
                 <w:sz w:val="14"/>
                 <w:szCs w:val="14"/>
               </w:rPr>
-              <w:t>N/A</w:t>
+              <w:t>73.49 ± 0.63</w:t>
             </w:r>
           </w:p>
         </w:tc>
@@ -12178,11 +12169,10 @@
             </w:pPr>
             <w:r>
               <w:rPr>
-                <w:rFonts w:eastAsia="Arial"/>
-                <w:sz w:val="14"/>
-                <w:szCs w:val="14"/>
-              </w:rPr>
-              <w:t>N/A</w:t>
+                <w:sz w:val="14"/>
+                <w:szCs w:val="14"/>
+              </w:rPr>
+              <w:t>0.03 ± 0.00</w:t>
             </w:r>
           </w:p>
         </w:tc>
@@ -12212,7 +12202,7 @@
                 <w:sz w:val="14"/>
                 <w:szCs w:val="14"/>
               </w:rPr>
-              <w:t>N/A</w:t>
+              <w:t>74.34 ± 0.49</w:t>
             </w:r>
           </w:p>
         </w:tc>
@@ -12242,7 +12232,7 @@
                 <w:sz w:val="14"/>
                 <w:szCs w:val="14"/>
               </w:rPr>
-              <w:t>N/A</w:t>
+              <w:t>2.04 ± 0.01</w:t>
             </w:r>
           </w:p>
         </w:tc>
@@ -12273,7 +12263,7 @@
                 <w:sz w:val="14"/>
                 <w:szCs w:val="14"/>
               </w:rPr>
-              <w:t>N/A</w:t>
+              <w:t>2.04 ± 0.01</w:t>
             </w:r>
           </w:p>
         </w:tc>
@@ -12303,7 +12293,7 @@
                 <w:sz w:val="14"/>
                 <w:szCs w:val="14"/>
               </w:rPr>
-              <w:t>N/A</w:t>
+              <w:t>73.70 ± 0.49</w:t>
             </w:r>
           </w:p>
         </w:tc>
@@ -12800,11 +12790,10 @@
             </w:pPr>
             <w:r>
               <w:rPr>
-                <w:rFonts w:eastAsia="Arial"/>
-                <w:sz w:val="14"/>
-                <w:szCs w:val="14"/>
-              </w:rPr>
-              <w:t>N/A</w:t>
+                <w:sz w:val="14"/>
+                <w:szCs w:val="14"/>
+              </w:rPr>
+              <w:t>0.03 ± 0.00</w:t>
             </w:r>
           </w:p>
         </w:tc>
@@ -12834,7 +12823,7 @@
                 <w:sz w:val="14"/>
                 <w:szCs w:val="14"/>
               </w:rPr>
-              <w:t>N/A</w:t>
+              <w:t>76.48 ± 0.25</w:t>
             </w:r>
           </w:p>
         </w:tc>
@@ -12864,7 +12853,7 @@
                 <w:sz w:val="14"/>
                 <w:szCs w:val="14"/>
               </w:rPr>
-              <w:t>N/A</w:t>
+              <w:t>1.98 ± 0.01</w:t>
             </w:r>
           </w:p>
         </w:tc>
@@ -12895,7 +12884,7 @@
                 <w:sz w:val="14"/>
                 <w:szCs w:val="14"/>
               </w:rPr>
-              <w:t>N/A</w:t>
+              <w:t>1.98 ± 0.01</w:t>
             </w:r>
           </w:p>
         </w:tc>
@@ -12925,7 +12914,7 @@
                 <w:sz w:val="14"/>
                 <w:szCs w:val="14"/>
               </w:rPr>
-              <w:t>N/A</w:t>
+              <w:t>75.79 ± 0.25</w:t>
             </w:r>
           </w:p>
         </w:tc>
@@ -13404,11 +13393,10 @@
             </w:pPr>
             <w:r>
               <w:rPr>
-                <w:rFonts w:eastAsia="Arial"/>
-                <w:sz w:val="14"/>
-                <w:szCs w:val="14"/>
-              </w:rPr>
-              <w:t>N/A</w:t>
+                <w:sz w:val="14"/>
+                <w:szCs w:val="14"/>
+              </w:rPr>
+              <w:t>0.03 ± 0.00</w:t>
             </w:r>
           </w:p>
         </w:tc>
@@ -13438,7 +13426,7 @@
                 <w:sz w:val="14"/>
                 <w:szCs w:val="14"/>
               </w:rPr>
-              <w:t>N/A</w:t>
+              <w:t>76.52 ± 0.16</w:t>
             </w:r>
           </w:p>
         </w:tc>
@@ -13468,7 +13456,7 @@
                 <w:sz w:val="14"/>
                 <w:szCs w:val="14"/>
               </w:rPr>
-              <w:t>N/A</w:t>
+              <w:t>1.98 ± 0.00</w:t>
             </w:r>
           </w:p>
         </w:tc>
@@ -13499,7 +13487,7 @@
                 <w:sz w:val="14"/>
                 <w:szCs w:val="14"/>
               </w:rPr>
-              <w:t>N/A</w:t>
+              <w:t>1.98 ± 0.00</w:t>
             </w:r>
           </w:p>
         </w:tc>
@@ -13529,7 +13517,7 @@
                 <w:sz w:val="14"/>
                 <w:szCs w:val="14"/>
               </w:rPr>
-              <w:t>N/A</w:t>
+              <w:t>75.84 ± 0.16</w:t>
             </w:r>
           </w:p>
         </w:tc>
@@ -14008,11 +13996,10 @@
             </w:pPr>
             <w:r>
               <w:rPr>
-                <w:rFonts w:eastAsia="Arial"/>
-                <w:sz w:val="14"/>
-                <w:szCs w:val="14"/>
-              </w:rPr>
-              <w:t>N/A</w:t>
+                <w:sz w:val="14"/>
+                <w:szCs w:val="14"/>
+              </w:rPr>
+              <w:t>0.03 ± 0.00</w:t>
             </w:r>
           </w:p>
         </w:tc>
@@ -14042,7 +14029,7 @@
                 <w:sz w:val="14"/>
                 <w:szCs w:val="14"/>
               </w:rPr>
-              <w:t>N/A</w:t>
+              <w:t>77.20 ± 1.11</w:t>
             </w:r>
           </w:p>
         </w:tc>
@@ -14072,7 +14059,7 @@
                 <w:sz w:val="14"/>
                 <w:szCs w:val="14"/>
               </w:rPr>
-              <w:t>N/A</w:t>
+              <w:t>1.96 ± 0.03</w:t>
             </w:r>
           </w:p>
         </w:tc>
@@ -14103,7 +14090,7 @@
                 <w:sz w:val="14"/>
                 <w:szCs w:val="14"/>
               </w:rPr>
-              <w:t>N/A</w:t>
+              <w:t>1.96 ± 0.03</w:t>
             </w:r>
           </w:p>
         </w:tc>
@@ -14133,7 +14120,7 @@
                 <w:sz w:val="14"/>
                 <w:szCs w:val="14"/>
               </w:rPr>
-              <w:t>N/A</w:t>
+              <w:t>76.51 ± 1.09</w:t>
             </w:r>
           </w:p>
         </w:tc>

</xml_diff>